<commit_message>
Reports overhaul: add VISITES COUVERTES table-loop + AVANCEMENT DU CHANTIER section to report template (cloned ASSISTAIENT OOXML, conditional avancement wrapper, verified byte-identical letterhead)
</commit_message>
<xml_diff>
--- a/public/templates/note-visite-chantier.docx
+++ b/public/templates/note-visite-chantier.docx
@@ -1333,6 +1333,280 @@
         </w:tc>
       </w:tr>
     </w:tbl>
+    <w:p>
+      <w:pPr>
+        <w:spacing w:line="240" w:lineRule="auto"/>
+        <w:rPr>
+          <w:sz w:val="20"/>
+          <w:szCs w:val="20"/>
+        </w:rPr>
+      </w:pPr>
+    </w:p>
+    <w:tbl>
+      <w:tblPr>
+        <w:tblStyle w:val="Grilledutableau"/>
+        <w:tblW w:w="9720" w:type="dxa"/>
+        <w:tblBorders>
+          <w:left w:val="none" w:sz="0" w:space="0" w:color="auto"/>
+          <w:right w:val="none" w:sz="0" w:space="0" w:color="auto"/>
+          <w:insideV w:val="none" w:sz="0" w:space="0" w:color="auto"/>
+        </w:tblBorders>
+        <w:tblLayout w:type="fixed"/>
+        <w:tblLook w:val="04A0" w:firstRow="1" w:lastRow="0" w:firstColumn="1" w:lastColumn="0" w:noHBand="0" w:noVBand="1"/>
+      </w:tblPr>
+      <w:tblGrid>
+        <w:gridCol w:w="2880"/>
+        <w:gridCol w:w="6840"/>
+      </w:tblGrid>
+      <w:tr>
+        <w:tc>
+          <w:tcPr>
+            <w:tcW w:w="9720" w:type="dxa"/>
+            <w:gridSpan w:val="2"/>
+            <w:tcBorders>
+              <w:top w:val="nil"/>
+              <w:bottom w:val="single" w:sz="4" w:space="0" w:color="auto"/>
+            </w:tcBorders>
+            <w:tcMar>
+              <w:left w:w="0" w:type="dxa"/>
+              <w:right w:w="0" w:type="dxa"/>
+            </w:tcMar>
+            <w:vAlign w:val="bottom"/>
+          </w:tcPr>
+          <w:p>
+            <w:pPr>
+              <w:spacing w:line="240" w:lineRule="auto"/>
+              <w:rPr>
+                <w:rFonts w:cs="Arial"/>
+                <w:b/>
+                <w:spacing w:val="4"/>
+                <w:sz w:val="16"/>
+                <w:szCs w:val="16"/>
+              </w:rPr>
+            </w:pPr>
+            <w:r>
+              <w:rPr>
+                <w:rFonts w:cs="Arial"/>
+                <w:b/>
+                <w:spacing w:val="4"/>
+                <w:sz w:val="16"/>
+                <w:szCs w:val="16"/>
+              </w:rPr>
+              <w:t>VISITES COUVERTES</w:t>
+            </w:r>
+          </w:p>
+        </w:tc>
+      </w:tr>
+      <w:tr>
+        <w:tc>
+          <w:tcPr>
+            <w:tcW w:w="2880" w:type="dxa"/>
+            <w:tcBorders>
+              <w:top w:val="nil"/>
+              <w:bottom w:val="single" w:sz="4" w:space="0" w:color="auto"/>
+            </w:tcBorders>
+            <w:tcMar>
+              <w:top w:w="115" w:type="dxa"/>
+              <w:left w:w="0" w:type="dxa"/>
+              <w:bottom w:w="29" w:type="dxa"/>
+              <w:right w:w="0" w:type="dxa"/>
+            </w:tcMar>
+            <w:vAlign w:val="bottom"/>
+          </w:tcPr>
+          <w:p>
+            <w:pPr>
+              <w:tabs>
+                <w:tab w:val="left" w:pos="6840"/>
+              </w:tabs>
+              <w:spacing w:line="240" w:lineRule="auto"/>
+              <w:rPr>
+                <w:rFonts w:cs="Arial"/>
+                <w:spacing w:val="4"/>
+              </w:rPr>
+            </w:pPr>
+            <w:r>
+              <w:rPr>
+                <w:rFonts w:cs="Arial"/>
+                <w:b/>
+                <w:spacing w:val="4"/>
+                <w:sz w:val="16"/>
+                <w:szCs w:val="16"/>
+              </w:rPr>
+              <w:t xml:space="preserve">DATE</w:t>
+            </w:r>
+          </w:p>
+        </w:tc>
+        <w:tc>
+          <w:tcPr>
+            <w:tcW w:w="6840" w:type="dxa"/>
+            <w:tcBorders>
+              <w:top w:val="nil"/>
+              <w:bottom w:val="single" w:sz="4" w:space="0" w:color="auto"/>
+            </w:tcBorders>
+            <w:tcMar>
+              <w:top w:w="115" w:type="dxa"/>
+              <w:left w:w="0" w:type="dxa"/>
+              <w:bottom w:w="29" w:type="dxa"/>
+              <w:right w:w="0" w:type="dxa"/>
+            </w:tcMar>
+            <w:vAlign w:val="bottom"/>
+          </w:tcPr>
+          <w:p>
+            <w:pPr>
+              <w:tabs>
+                <w:tab w:val="left" w:pos="6840"/>
+              </w:tabs>
+              <w:spacing w:line="240" w:lineRule="auto"/>
+              <w:rPr>
+                <w:rFonts w:cs="Arial"/>
+                <w:spacing w:val="4"/>
+              </w:rPr>
+            </w:pPr>
+            <w:r>
+              <w:rPr>
+                <w:rFonts w:cs="Arial"/>
+                <w:b/>
+                <w:spacing w:val="4"/>
+                <w:sz w:val="16"/>
+                <w:szCs w:val="16"/>
+              </w:rPr>
+              <w:t xml:space="preserve">PAR</w:t>
+            </w:r>
+          </w:p>
+        </w:tc>
+      </w:tr>
+      <w:tr>
+        <w:tc>
+          <w:tcPr>
+            <w:tcW w:w="2880" w:type="dxa"/>
+            <w:tcBorders>
+              <w:top w:val="single" w:sz="4" w:space="0" w:color="auto"/>
+              <w:bottom w:val="nil"/>
+            </w:tcBorders>
+            <w:tcMar>
+              <w:top w:w="115" w:type="dxa"/>
+              <w:left w:w="0" w:type="dxa"/>
+              <w:bottom w:w="29" w:type="dxa"/>
+              <w:right w:w="0" w:type="dxa"/>
+            </w:tcMar>
+            <w:vAlign w:val="bottom"/>
+          </w:tcPr>
+          <w:p>
+            <w:pPr>
+              <w:tabs>
+                <w:tab w:val="left" w:pos="6840"/>
+              </w:tabs>
+              <w:spacing w:line="240" w:lineRule="auto"/>
+              <w:rPr>
+                <w:rFonts w:cs="Arial"/>
+                <w:spacing w:val="4"/>
+              </w:rPr>
+            </w:pPr>
+            <w:r>
+              <w:rPr>
+                <w:rFonts w:cs="Arial"/>
+                <w:spacing w:val="4"/>
+              </w:rPr>
+              <w:t xml:space="preserve">{#reportVisits}{visitDate}</w:t>
+            </w:r>
+          </w:p>
+        </w:tc>
+        <w:tc>
+          <w:tcPr>
+            <w:tcW w:w="6840" w:type="dxa"/>
+            <w:tcBorders>
+              <w:top w:val="single" w:sz="4" w:space="0" w:color="auto"/>
+              <w:bottom w:val="nil"/>
+            </w:tcBorders>
+            <w:tcMar>
+              <w:top w:w="115" w:type="dxa"/>
+              <w:left w:w="0" w:type="dxa"/>
+              <w:bottom w:w="29" w:type="dxa"/>
+              <w:right w:w="0" w:type="dxa"/>
+            </w:tcMar>
+            <w:vAlign w:val="bottom"/>
+          </w:tcPr>
+          <w:p>
+            <w:pPr>
+              <w:tabs>
+                <w:tab w:val="left" w:pos="6840"/>
+              </w:tabs>
+              <w:spacing w:line="240" w:lineRule="auto"/>
+              <w:rPr>
+                <w:rFonts w:cs="Arial"/>
+                <w:spacing w:val="4"/>
+              </w:rPr>
+            </w:pPr>
+            <w:r>
+              <w:rPr>
+                <w:rFonts w:cs="Arial"/>
+                <w:spacing w:val="4"/>
+              </w:rPr>
+              <w:t xml:space="preserve">{visitBy}{/reportVisits}</w:t>
+            </w:r>
+          </w:p>
+        </w:tc>
+      </w:tr>
+    </w:tbl>
+    <w:p>
+      <w:pPr>
+        <w:spacing w:line="240" w:lineRule="auto"/>
+        <w:rPr>
+          <w:sz w:val="20"/>
+          <w:szCs w:val="20"/>
+        </w:rPr>
+      </w:pPr>
+    </w:p>
+    <w:p>
+      <w:pPr>
+        <w:spacing w:line="240" w:lineRule="auto"/>
+      </w:pPr>
+      <w:r>
+        <w:t xml:space="preserve">{#avancement}</w:t>
+      </w:r>
+    </w:p>
+    <w:p>
+      <w:pPr>
+        <w:spacing w:line="240" w:lineRule="auto"/>
+        <w:rPr>
+          <w:bCs/>
+          <w:sz w:val="19"/>
+          <w:szCs w:val="19"/>
+        </w:rPr>
+      </w:pPr>
+      <w:r>
+        <w:rPr>
+          <w:b/>
+          <w:sz w:val="19"/>
+          <w:szCs w:val="19"/>
+        </w:rPr>
+        <w:t>AVANCEMENT DU CHANTIER</w:t>
+      </w:r>
+    </w:p>
+    <w:p>
+      <w:pPr>
+        <w:spacing w:line="240" w:lineRule="auto"/>
+        <w:rPr>
+          <w:rFonts w:cs="Arial"/>
+          <w:spacing w:val="4"/>
+        </w:rPr>
+      </w:pPr>
+      <w:r>
+        <w:rPr>
+          <w:rFonts w:cs="Arial"/>
+          <w:spacing w:val="4"/>
+        </w:rPr>
+        <w:t xml:space="preserve">{avancement}</w:t>
+      </w:r>
+    </w:p>
+    <w:p>
+      <w:pPr>
+        <w:spacing w:line="240" w:lineRule="auto"/>
+      </w:pPr>
+      <w:r>
+        <w:t xml:space="preserve">{/avancement}</w:t>
+      </w:r>
+    </w:p>
     <w:p>
       <w:pPr>
         <w:spacing w:line="240" w:lineRule="auto"/>

</xml_diff>